<commit_message>
Doku: Admin-Hinweis, Auktionslogik und Anhang-Nummerierung korrigiert
</commit_message>
<xml_diff>
--- a/Projektdokumentation_CultPlanet.docx
+++ b/Projektdokumentation_CultPlanet.docx
@@ -112,7 +112,7 @@
           <w:sz w:val="21"/>
           <w:szCs w:val="21"/>
         </w:rPr>
-        <w:t>CultPlanet ist ein vollständiger Spielzeug-Onlineshop mit neun Datenbanktabellen, drei Benutzerrollen (Kunde, Mitarbeiter, Admin) und 133 automatisierten Tests. Die Anwendung läuft lokal unter WAMP und nutzt Laravel 13, MySQL, Blade-Templates, Tailwind CSS v4 und Vanilla JavaScript.</w:t>
+        <w:t>CultPlanet ist ein vollständiger Spielzeug-Onlineshop mit neun Datenbanktabellen, drei Benutzerrollen (Kunde, Mitarbeiter, Admin) und 133 automatisierten Tests. Die Anwendung läuft lokal unter WAMP und nutzt Laravel 13, MySQL, Blade-Templates, Tailwind CSS v4 und Alpine.js.</w:t>
       </w:r>
     </w:p>
     <w:p>
@@ -213,7 +213,7 @@
           <w:color w:val="374151"/>
           <w:lang w:val="en-US"/>
         </w:rPr>
-        <w:t>Blade-Templates, Tailwind CSS v4, Vanilla JavaScript</w:t>
+        <w:t>Blade-Templates, Tailwind CSS v4, Alpine.js</w:t>
       </w:r>
     </w:p>
     <w:p>
@@ -787,7 +787,7 @@
           <w:sz w:val="21"/>
           <w:szCs w:val="21"/>
         </w:rPr>
-        <w:t>Die Anwendung ist durch 133 PHPUnit-Tests in zwölf Testdateien abgesichert. Die Tests decken alle kritischen Bereiche ab:</w:t>
+        <w:t>Die Anwendung ist durch 133 PHPUnit-Tests in 22 Testdateien abgesichert. Die Tests decken alle kritischen Bereiche ab:</w:t>
       </w:r>
     </w:p>
     <w:p>
@@ -987,7 +987,7 @@
           <w:szCs w:val="21"/>
         </w:rPr>
         <w:lastRenderedPageBreak/>
-        <w:t>Ein Produkt kann mehrere sequenzielle Auktionen haben, aber nicht mehrere gleichzeitig. Der tatsächlich verfügbare Lagerbestand wird als stock minus Anzahl aktiver oder geplanter Auktionen berechnet. Dieser Wert wird beim Warenkorb-Befüllen und bei der Auktionsplanung geprüft, sodass kein Produkt doppelt vergeben werden kann.</w:t>
+        <w:t>Es dürfen höchstens so viele geplante oder aktive Auktionen für ein Produkt existieren wie Stückzahl im Lager vorhanden ist. Der tatsächlich verfügbare Lagerbestand wird als stock minus Anzahl aktiver oder geplanter Auktionen berechnet. Dieser Wert wird beim Warenkorb-Befüllen und bei der Auktionsplanung geprüft, sodass kein Produkt doppelt vergeben werden kann.</w:t>
       </w:r>
     </w:p>
     <w:p>
@@ -1114,7 +1114,7 @@
           <w:sz w:val="21"/>
           <w:szCs w:val="21"/>
         </w:rPr>
-        <w:t xml:space="preserve"> zur Verfügung (Admin muss einmalig manuell angelegt werden):</w:t>
+        <w:t xml:space="preserve"> zur Verfügung. Kunden- und Mitarbeiteraccounts werden automatisch per Seeder angelegt. Der Admin-Account (admin@example.com) muss einmalig manuell registriert und die Rolle anschließend über die Datenbank oder einen separaten Befehl zugewiesen werden:</w:t>
       </w:r>
     </w:p>
     <w:p>
@@ -1394,7 +1394,7 @@
           <w:sz w:val="21"/>
           <w:szCs w:val="21"/>
         </w:rPr>
-        <w:t>/admin</w:t>
+        <w:t>/admin/dashboard</w:t>
       </w:r>
       <w:r>
         <w:rPr>
@@ -1425,7 +1425,7 @@
           <w:sz w:val="19"/>
           <w:szCs w:val="19"/>
         </w:rPr>
-        <w:t xml:space="preserve">Hinweis: Zahlungen (PayPal, Sofortüberweisung) sind Attrappen ohne echte Transaktion. Die Auktionsfunktion ist unter /auctions erreichbar. Für das automatische Schließen abgelaufener Auktionen: </w:t>
+        <w:t xml:space="preserve">Hinweis: Zahlungen (PayPal, Sofortüberweisung) sind Attrappen ohne echte Transaktion. Die Auktionsfunktion ist unter /auktion erreichbar. Für das automatische Schließen abgelaufener Auktionen: </w:t>
       </w:r>
       <w:r>
         <w:rPr>
@@ -1480,13 +1480,7 @@
       </w:pPr>
       <w:r>
         <w:lastRenderedPageBreak/>
-        <w:t>8</w:t>
-      </w:r>
-      <w:r>
-        <w:t xml:space="preserve">. </w:t>
-      </w:r>
-      <w:r>
-        <w:t>Ablaufdiagramm</w:t>
+        <w:t>Anhang A: Ablaufdiagramm</w:t>
       </w:r>
     </w:p>
     <w:p>
@@ -1496,8 +1490,6 @@
       </w:pPr>
       <w:r>
         <w:br/>
-      </w:r>
-      <w:r>
         <w:drawing>
           <wp:inline distT="0" distB="0" distL="0" distR="0" wp14:anchorId="2958E64A" wp14:editId="52877355">
             <wp:extent cx="4048690" cy="8030696"/>
@@ -1549,13 +1541,7 @@
       </w:pPr>
       <w:r>
         <w:lastRenderedPageBreak/>
-        <w:t>9</w:t>
-      </w:r>
-      <w:r>
-        <w:t xml:space="preserve">. </w:t>
-      </w:r>
-      <w:r>
-        <w:t>ER Diagramm</w:t>
+        <w:t>Anhang B: ER-Diagramm</w:t>
       </w:r>
     </w:p>
     <w:p>
@@ -1565,8 +1551,6 @@
       </w:pPr>
       <w:r>
         <w:br/>
-      </w:r>
-      <w:r>
         <w:drawing>
           <wp:inline distT="0" distB="0" distL="0" distR="0" wp14:anchorId="478CC032" wp14:editId="6EE3D5E9">
             <wp:extent cx="6188710" cy="4069080"/>

</xml_diff>